<commit_message>
docs(G2-R03): fix reviewed SRS chapter order
</commit_message>
<xml_diff>
--- a/docs/deliverables/08-软件需求规格说明书SRS.docx
+++ b/docs/deliverables/08-软件需求规格说明书SRS.docx
@@ -612,11 +612,6 @@
       <w:pPr>
         <w:jc val="center"/>
       </w:pPr>
-      <w:r>
-        <w:t>目 录（续）</w:t>
-      </w:r>
-    </w:p>
-    <w:p>
       <w:r>
         <w:t>3.6 核心业务流程与异常路径</w:t>
         <w:tab/>
@@ -672,6 +667,61 @@
       </w:r>
     </w:p>
     <w:p>
+      <w:r>
+        <w:t>3.6 核心业务流程与异常路径</w:t>
+        <w:tab/>
+        <w:t>10</w:t>
+        <w:br/>
+        <w:t>3.7 核心状态模型</w:t>
+        <w:tab/>
+        <w:t>10</w:t>
+        <w:br/>
+        <w:t>4 外部接口需求</w:t>
+        <w:tab/>
+        <w:t>10</w:t>
+        <w:br/>
+        <w:t>5 数据需求</w:t>
+        <w:tab/>
+        <w:t>11</w:t>
+        <w:br/>
+        <w:t>5.1 核心数据对象</w:t>
+        <w:tab/>
+        <w:t>11</w:t>
+        <w:br/>
+        <w:t>5.2 核心实体字段字典</w:t>
+        <w:tab/>
+        <w:t>11</w:t>
+        <w:br/>
+        <w:t>5.3 数据质量与来源</w:t>
+        <w:tab/>
+        <w:t>12</w:t>
+        <w:br/>
+        <w:t>5.4 数据安全与审计</w:t>
+        <w:tab/>
+        <w:t>12</w:t>
+        <w:br/>
+        <w:t>6 非功能需求</w:t>
+        <w:tab/>
+        <w:t>12</w:t>
+        <w:br/>
+        <w:t>7 部署、交付与服务约束</w:t>
+        <w:tab/>
+        <w:t>13</w:t>
+        <w:br/>
+        <w:t>8 验收与追踪</w:t>
+        <w:tab/>
+        <w:t>14</w:t>
+        <w:br/>
+        <w:t>9 变更控制与待澄清事项</w:t>
+        <w:tab/>
+        <w:t>14</w:t>
+        <w:br/>
+        <w:t>10 G2规格化阶段补充业务规则</w:t>
+        <w:tab/>
+        <w:t>15</w:t>
+      </w:r>
+    </w:p>
+    <w:p>
       <w:pPr>
         <w:pStyle w:val="1"/>
       </w:pPr>
@@ -5694,14 +5744,6 @@
     </w:tbl>
     <w:p>
       <w:pPr>
-        <w:pStyle w:val="1"/>
-      </w:pPr>
-      <w:r>
-        <w:t>4 外部接口需求</w:t>
-      </w:r>
-    </w:p>
-    <w:p>
-      <w:pPr>
         <w:pStyle w:val="2"/>
       </w:pPr>
       <w:r>
@@ -6858,6 +6900,14 @@
         </w:tc>
       </w:tr>
     </w:tbl>
+    <w:p>
+      <w:pPr>
+        <w:pStyle w:val="1"/>
+      </w:pPr>
+      <w:r>
+        <w:t>4 外部接口需求</w:t>
+      </w:r>
+    </w:p>
     <w:p>
       <w:pPr>
         <w:keepNext/>
@@ -7749,6 +7799,15 @@
       <w:pPr/>
       <w:r>
         <w:t>系统至少管理预案及版本、流程与任务模板、事件与续报、处置任务、人员与位置状态、物资站点与台账、盘点计划与快照、值班打卡、演练计划与评估、消息回执、外部调用、附件和审计记录。</w:t>
+      </w:r>
+    </w:p>
+    <w:p>
+      <w:pPr>
+        <w:keepNext/>
+        <w:jc w:val="center"/>
+      </w:pPr>
+      <w:r>
+        <w:t>表 5-1 核心实体字段字典</w:t>
       </w:r>
     </w:p>
     <w:p>

</xml_diff>

<commit_message>
revert: restore repository to 098e488 content
</commit_message>
<xml_diff>
--- a/docs/deliverables/08-软件需求规格说明书SRS.docx
+++ b/docs/deliverables/08-软件需求规格说明书SRS.docx
@@ -612,6 +612,11 @@
       <w:pPr>
         <w:jc val="center"/>
       </w:pPr>
+      <w:r>
+        <w:t>目 录（续）</w:t>
+      </w:r>
+    </w:p>
+    <w:p>
       <w:r>
         <w:t>3.6 核心业务流程与异常路径</w:t>
         <w:tab/>
@@ -667,61 +672,6 @@
       </w:r>
     </w:p>
     <w:p>
-      <w:r>
-        <w:t>3.6 核心业务流程与异常路径</w:t>
-        <w:tab/>
-        <w:t>10</w:t>
-        <w:br/>
-        <w:t>3.7 核心状态模型</w:t>
-        <w:tab/>
-        <w:t>10</w:t>
-        <w:br/>
-        <w:t>4 外部接口需求</w:t>
-        <w:tab/>
-        <w:t>10</w:t>
-        <w:br/>
-        <w:t>5 数据需求</w:t>
-        <w:tab/>
-        <w:t>11</w:t>
-        <w:br/>
-        <w:t>5.1 核心数据对象</w:t>
-        <w:tab/>
-        <w:t>11</w:t>
-        <w:br/>
-        <w:t>5.2 核心实体字段字典</w:t>
-        <w:tab/>
-        <w:t>11</w:t>
-        <w:br/>
-        <w:t>5.3 数据质量与来源</w:t>
-        <w:tab/>
-        <w:t>12</w:t>
-        <w:br/>
-        <w:t>5.4 数据安全与审计</w:t>
-        <w:tab/>
-        <w:t>12</w:t>
-        <w:br/>
-        <w:t>6 非功能需求</w:t>
-        <w:tab/>
-        <w:t>12</w:t>
-        <w:br/>
-        <w:t>7 部署、交付与服务约束</w:t>
-        <w:tab/>
-        <w:t>13</w:t>
-        <w:br/>
-        <w:t>8 验收与追踪</w:t>
-        <w:tab/>
-        <w:t>14</w:t>
-        <w:br/>
-        <w:t>9 变更控制与待澄清事项</w:t>
-        <w:tab/>
-        <w:t>14</w:t>
-        <w:br/>
-        <w:t>10 G2规格化阶段补充业务规则</w:t>
-        <w:tab/>
-        <w:t>15</w:t>
-      </w:r>
-    </w:p>
-    <w:p>
       <w:pPr>
         <w:pStyle w:val="1"/>
       </w:pPr>
@@ -5744,6 +5694,14 @@
     </w:tbl>
     <w:p>
       <w:pPr>
+        <w:pStyle w:val="1"/>
+      </w:pPr>
+      <w:r>
+        <w:t>4 外部接口需求</w:t>
+      </w:r>
+    </w:p>
+    <w:p>
+      <w:pPr>
         <w:pStyle w:val="2"/>
       </w:pPr>
       <w:r>
@@ -6900,14 +6858,6 @@
         </w:tc>
       </w:tr>
     </w:tbl>
-    <w:p>
-      <w:pPr>
-        <w:pStyle w:val="1"/>
-      </w:pPr>
-      <w:r>
-        <w:t>4 外部接口需求</w:t>
-      </w:r>
-    </w:p>
     <w:p>
       <w:pPr>
         <w:keepNext/>
@@ -7799,15 +7749,6 @@
       <w:pPr/>
       <w:r>
         <w:t>系统至少管理预案及版本、流程与任务模板、事件与续报、处置任务、人员与位置状态、物资站点与台账、盘点计划与快照、值班打卡、演练计划与评估、消息回执、外部调用、附件和审计记录。</w:t>
-      </w:r>
-    </w:p>
-    <w:p>
-      <w:pPr>
-        <w:keepNext/>
-        <w:jc w:val="center"/>
-      </w:pPr>
-      <w:r>
-        <w:t>表 5-1 核心实体字段字典</w:t>
       </w:r>
     </w:p>
     <w:p>

</xml_diff>

<commit_message>
docs(G2-R03): repair SRS review blockers
</commit_message>
<xml_diff>
--- a/docs/deliverables/08-软件需求规格说明书SRS.docx
+++ b/docs/deliverables/08-软件需求规格说明书SRS.docx
@@ -8,7 +8,7 @@
         <w:jc w:val="right"/>
       </w:pPr>
       <w:r>
-        <w:t>YJGL-G2-03    V1.1</w:t>
+        <w:t>YJGL-G2-03    V1.2</w:t>
       </w:r>
     </w:p>
     <w:p>
@@ -198,7 +198,7 @@
         <w:jc w:val="left"/>
       </w:pPr>
       <w:r>
-        <w:t>编制日期：2026 年 9 月 15 日</w:t>
+        <w:t>编制日期：2026 年 9 月 16 日</w:t>
       </w:r>
     </w:p>
     <w:p>
@@ -540,6 +540,103 @@
                 <w:rFonts w:ascii="宋体" w:hAnsi="宋体" w:eastAsia="宋体"/>
                 <w:b w:val="0"/>
                 <w:sz w:val="17"/>
+              </w:rPr>
+              <w:t>何思源</w:t>
+            </w:r>
+          </w:p>
+        </w:tc>
+      </w:tr>
+      <w:tr>
+        <w:tc>
+          <w:tcPr>
+            <w:tcW w:type="dxa" w:w="1468"/>
+            <w:vAlign w:val="center"/>
+          </w:tcPr>
+          <w:p>
+            <w:pPr>
+              <w:spacing w:before="0" w:after="0" w:line="240" w:lineRule="auto"/>
+            </w:pPr>
+            <w:r>
+              <w:rPr>
+                <w:rFonts w:ascii="宋体" w:hAnsi="宋体" w:eastAsia="宋体"/>
+                <w:b w:val="0"/>
+                <w:sz w:val="15"/>
+              </w:rPr>
+              <w:t>V1.2</w:t>
+            </w:r>
+          </w:p>
+        </w:tc>
+        <w:tc>
+          <w:tcPr>
+            <w:tcW w:type="dxa" w:w="1487"/>
+            <w:vAlign w:val="center"/>
+          </w:tcPr>
+          <w:p>
+            <w:pPr>
+              <w:spacing w:before="0" w:after="0" w:line="240" w:lineRule="auto"/>
+            </w:pPr>
+            <w:r>
+              <w:rPr>
+                <w:rFonts w:ascii="宋体" w:hAnsi="宋体" w:eastAsia="宋体"/>
+                <w:b w:val="0"/>
+                <w:sz w:val="15"/>
+              </w:rPr>
+              <w:t>2026-09-16</w:t>
+            </w:r>
+          </w:p>
+        </w:tc>
+        <w:tc>
+          <w:tcPr>
+            <w:tcW w:type="dxa" w:w="1464"/>
+            <w:vAlign w:val="center"/>
+          </w:tcPr>
+          <w:p>
+            <w:pPr>
+              <w:spacing w:before="0" w:after="0" w:line="240" w:lineRule="auto"/>
+            </w:pPr>
+            <w:r>
+              <w:rPr>
+                <w:rFonts w:ascii="宋体" w:hAnsi="宋体" w:eastAsia="宋体"/>
+                <w:b w:val="0"/>
+                <w:sz w:val="15"/>
+              </w:rPr>
+              <w:t>第3、8章；目录</w:t>
+            </w:r>
+          </w:p>
+        </w:tc>
+        <w:tc>
+          <w:tcPr>
+            <w:tcW w:type="dxa" w:w="3178"/>
+            <w:vAlign w:val="center"/>
+          </w:tcPr>
+          <w:p>
+            <w:pPr>
+              <w:spacing w:before="0" w:after="0" w:line="240" w:lineRule="auto"/>
+            </w:pPr>
+            <w:r>
+              <w:rPr>
+                <w:rFonts w:ascii="宋体" w:hAnsi="宋体" w:eastAsia="宋体"/>
+                <w:b w:val="0"/>
+                <w:sz w:val="15"/>
+              </w:rPr>
+              <w:t>按 C Review 修正流程/状态插入顺序、39/39 AC 完整性表述及重复目录续段，并重建渲染证据。</w:t>
+            </w:r>
+          </w:p>
+        </w:tc>
+        <w:tc>
+          <w:tcPr>
+            <w:tcW w:type="dxa" w:w="1419"/>
+            <w:vAlign w:val="center"/>
+          </w:tcPr>
+          <w:p>
+            <w:pPr>
+              <w:spacing w:before="0" w:after="0" w:line="240" w:lineRule="auto"/>
+            </w:pPr>
+            <w:r>
+              <w:rPr>
+                <w:rFonts w:ascii="宋体" w:hAnsi="宋体" w:eastAsia="宋体"/>
+                <w:b w:val="0"/>
+                <w:sz w:val="15"/>
               </w:rPr>
               <w:t>何思源</w:t>
             </w:r>
@@ -612,11 +709,6 @@
       <w:pPr>
         <w:jc val="center"/>
       </w:pPr>
-      <w:r>
-        <w:t>目 录（续）</w:t>
-      </w:r>
-    </w:p>
-    <w:p>
       <w:r>
         <w:t>3.6 核心业务流程与异常路径</w:t>
         <w:tab/>
@@ -5694,14 +5786,6 @@
     </w:tbl>
     <w:p>
       <w:pPr>
-        <w:pStyle w:val="1"/>
-      </w:pPr>
-      <w:r>
-        <w:t>4 外部接口需求</w:t>
-      </w:r>
-    </w:p>
-    <w:p>
-      <w:pPr>
         <w:pStyle w:val="2"/>
       </w:pPr>
       <w:r>
@@ -6858,6 +6942,14 @@
         </w:tc>
       </w:tr>
     </w:tbl>
+    <w:p>
+      <w:pPr>
+        <w:pStyle w:val="1"/>
+      </w:pPr>
+      <w:r>
+        <w:t>4 外部接口需求</w:t>
+      </w:r>
+    </w:p>
     <w:p>
       <w:pPr>
         <w:keepNext/>
@@ -7753,6 +7845,42 @@
     </w:p>
     <w:p>
       <w:pPr>
+        <w:keepNext/>
+        <w:jc w:val="center"/>
+      </w:pPr>
+      <w:r>
+        <w:t>表 5-1 核心实体字段字典</w:t>
+      </w:r>
+    </w:p>
+    <w:p>
+      <w:pPr>
+        <w:keepNext/>
+        <w:jc w:val="center"/>
+      </w:pPr>
+      <w:r>
+        <w:t>表 5-1 核心实体字段字典</w:t>
+      </w:r>
+    </w:p>
+    <w:p>
+      <w:pPr>
+        <w:keepNext/>
+        <w:jc w:val="center"/>
+      </w:pPr>
+      <w:r>
+        <w:t>表 5-1 核心实体字段字典</w:t>
+      </w:r>
+    </w:p>
+    <w:p>
+      <w:pPr>
+        <w:keepNext/>
+        <w:jc w:val="center"/>
+      </w:pPr>
+      <w:r>
+        <w:t>表 5-1 核心实体字段字典</w:t>
+      </w:r>
+    </w:p>
+    <w:p>
+      <w:pPr>
         <w:pStyle w:val="2"/>
       </w:pPr>
       <w:r>
@@ -11772,13 +11900,7 @@
         <w:pStyle w:val="a4"/>
       </w:pPr>
       <w:r>
-        <w:t xml:space="preserve">29 条 G2-FR 均有至少一个 </w:t>
-      </w:r>
-      <w:r>
-        <w:t>AC-G2-FR-nnn-xx</w:t>
-      </w:r>
-      <w:r>
-        <w:t xml:space="preserve"> 验收标准。</w:t>
+        <w:t>39 条 G2-FR 均有至少一个 AC-G2-FR-nnn-xx 验收标准。</w:t>
       </w:r>
     </w:p>
     <w:p>

</xml_diff>

<commit_message>
docs(G2-R03): remove duplicate field dictionary caption
</commit_message>
<xml_diff>
--- a/docs/deliverables/08-软件需求规格说明书SRS.docx
+++ b/docs/deliverables/08-软件需求规格说明书SRS.docx
@@ -7845,42 +7845,6 @@
     </w:p>
     <w:p>
       <w:pPr>
-        <w:keepNext/>
-        <w:jc w:val="center"/>
-      </w:pPr>
-      <w:r>
-        <w:t>表 5-1 核心实体字段字典</w:t>
-      </w:r>
-    </w:p>
-    <w:p>
-      <w:pPr>
-        <w:keepNext/>
-        <w:jc w:val="center"/>
-      </w:pPr>
-      <w:r>
-        <w:t>表 5-1 核心实体字段字典</w:t>
-      </w:r>
-    </w:p>
-    <w:p>
-      <w:pPr>
-        <w:keepNext/>
-        <w:jc w:val="center"/>
-      </w:pPr>
-      <w:r>
-        <w:t>表 5-1 核心实体字段字典</w:t>
-      </w:r>
-    </w:p>
-    <w:p>
-      <w:pPr>
-        <w:keepNext/>
-        <w:jc w:val="center"/>
-      </w:pPr>
-      <w:r>
-        <w:t>表 5-1 核心实体字段字典</w:t>
-      </w:r>
-    </w:p>
-    <w:p>
-      <w:pPr>
         <w:pStyle w:val="2"/>
       </w:pPr>
       <w:r>
@@ -9471,15 +9435,6 @@
       </w:pPr>
       <w:r>
         <w:t>5.3 数据质量与来源</w:t>
-      </w:r>
-    </w:p>
-    <w:p>
-      <w:pPr>
-        <w:keepNext/>
-        <w:jc w:val="center"/>
-      </w:pPr>
-      <w:r>
-        <w:t>表 5-1 核心实体字段字典</w:t>
       </w:r>
     </w:p>
     <w:p>

</xml_diff>

<commit_message>
docs(G2-R05): sync RCLR updates to formal deliverables
</commit_message>
<xml_diff>
--- a/docs/deliverables/08-软件需求规格说明书SRS.docx
+++ b/docs/deliverables/08-软件需求规格说明书SRS.docx
@@ -665,6 +665,58 @@
                 <w:b w:val="0"/>
                 <w:sz w:val="15"/>
               </w:rPr>
+              <w:t>何思源</w:t>
+            </w:r>
+          </w:p>
+        </w:tc>
+      </w:tr>
+      <w:tr>
+        <w:tc>
+          <w:tcPr>
+            <w:tcW w:type="dxa" w:w="1468"/>
+          </w:tcPr>
+          <w:p>
+            <w:r>
+              <w:t>V1.3</w:t>
+            </w:r>
+          </w:p>
+        </w:tc>
+        <w:tc>
+          <w:tcPr>
+            <w:tcW w:type="dxa" w:w="1487"/>
+          </w:tcPr>
+          <w:p>
+            <w:r>
+              <w:t>2026-09-16</w:t>
+            </w:r>
+          </w:p>
+        </w:tc>
+        <w:tc>
+          <w:tcPr>
+            <w:tcW w:type="dxa" w:w="1464"/>
+          </w:tcPr>
+          <w:p>
+            <w:r>
+              <w:t>第3章</w:t>
+            </w:r>
+          </w:p>
+        </w:tc>
+        <w:tc>
+          <w:tcPr>
+            <w:tcW w:type="dxa" w:w="3178"/>
+          </w:tcPr>
+          <w:p>
+            <w:r>
+              <w:t>G2-R05 同步 RCLR 双镜像状态，清除 spec/RTM 待同步旧表述。</w:t>
+            </w:r>
+          </w:p>
+        </w:tc>
+        <w:tc>
+          <w:tcPr>
+            <w:tcW w:type="dxa" w:w="1419"/>
+          </w:tcPr>
+          <w:p>
+            <w:r>
               <w:t>何思源</w:t>
             </w:r>
           </w:p>
@@ -5329,7 +5381,7 @@
                 <w:b w:val="0"/>
                 <w:sz w:val="17"/>
               </w:rPr>
-              <w:t>FR-013—016、027；RCLR-001、002、004、010；spec/RTM待同步</w:t>
+              <w:t>FR-013—016、027；RCLR-001、002、004、010；spec/RTM已同步</w:t>
             </w:r>
           </w:p>
         </w:tc>
@@ -5406,7 +5458,7 @@
                 <w:b w:val="0"/>
                 <w:sz w:val="17"/>
               </w:rPr>
-              <w:t>FR-003、015、022；RCLR-003、008、010；spec/RTM待同步</w:t>
+              <w:t>FR-003、015、022；RCLR-003、008、010；spec/RTM已同步</w:t>
             </w:r>
           </w:p>
         </w:tc>
@@ -5483,7 +5535,7 @@
                 <w:b w:val="0"/>
                 <w:sz w:val="17"/>
               </w:rPr>
-              <w:t>FR-010—012、023；RCLR-007；spec/RTM待同步</w:t>
+              <w:t>FR-010—012、023；RCLR-007；spec/RTM已同步</w:t>
             </w:r>
           </w:p>
         </w:tc>
@@ -5560,7 +5612,7 @@
                 <w:b w:val="0"/>
                 <w:sz w:val="17"/>
               </w:rPr>
-              <w:t>FR-008、009、025；RCLR-006；spec/RTM待同步</w:t>
+              <w:t>FR-008、009、025；RCLR-006；spec/RTM已同步</w:t>
             </w:r>
           </w:p>
         </w:tc>
@@ -5637,7 +5689,7 @@
                 <w:b w:val="0"/>
                 <w:sz w:val="17"/>
               </w:rPr>
-              <w:t>FR-017—020、024、032；RCLR-005、008；spec/RTM待同步</w:t>
+              <w:t>FR-017—020、024、032；RCLR-005、008；spec/RTM已同步</w:t>
             </w:r>
           </w:p>
         </w:tc>
@@ -5714,7 +5766,7 @@
                 <w:b w:val="0"/>
                 <w:sz w:val="17"/>
               </w:rPr>
-              <w:t>FR-005、029；RCLR-009；spec/RTM待同步</w:t>
+              <w:t>FR-005、029；RCLR-009；spec/RTM已同步</w:t>
             </w:r>
           </w:p>
         </w:tc>
@@ -11317,7 +11369,7 @@
         <w:jc w:val="right"/>
       </w:pPr>
       <w:r>
-        <w:t>G2-R05应在spec.md中使用本文件相同的G2-FR和AC编号，并将本轮标记为“spec/RTM待同步”的可观察规则补入双镜像。RTM至少追踪原始FR、G2-FR、用户故事、AC、G2-RCLR、设计、实现、测试和结果；任何编号、范围或验收语义差异均阻断M2返工准出。</w:t>
+        <w:t>G2-R05应在spec.md中使用本文件相同的G2-FR和AC编号，并将本轮标记为“spec/RTM已同步”的可观察规则补入双镜像。RTM至少追踪原始FR、G2-FR、用户故事、AC、G2-RCLR、设计、实现、测试和结果；任何编号、范围或验收语义差异均阻断M2返工准出。</w:t>
       </w:r>
     </w:p>
     <w:p>

</xml_diff>

<commit_message>
fix(G2-R05): align SRS synchronization status
</commit_message>
<xml_diff>
--- a/docs/deliverables/08-软件需求规格说明书SRS.docx
+++ b/docs/deliverables/08-软件需求规格说明书SRS.docx
@@ -1293,7 +1293,7 @@
         <w:jc w:val="right"/>
       </w:pPr>
       <w:r>
-        <w:t>下表保留39条受控功能需求及既有验收标准。G2-R02已完成反向澄清裁决，G2-R03仅补充需求级流程、状态、字段和量化语义；本轮影响AC的可观察规则均标记为G2-R05对spec.md与RTM的待同步项。</w:t>
+        <w:t>下表保留39条受控功能需求及既有验收标准。G2-R02已完成反向澄清裁决，G2-R03仅补充需求级流程、状态、字段和量化语义；本轮影响AC的可观察规则已在G2-R05完成对spec.md与RTM的10/10同步。</w:t>
       </w:r>
     </w:p>
     <w:p>
@@ -5188,7 +5188,7 @@
           <w:sz w:val="28"/>
           <w:szCs w:val="28"/>
         </w:rPr>
-        <w:t>3.6核心业务流程与异常路径。表3-6覆盖主路径及异常路径；其可观察规则将在G2-R05同步至spec.md和RTM。</w:t>
+        <w:t>3.6核心业务流程与异常路径。表3-6覆盖主路径及异常路径；其可观察规则已在G2-R05同步至spec.md和RTM。</w:t>
       </w:r>
     </w:p>
     <w:p>
@@ -5304,7 +5304,7 @@
                 <w:b/>
                 <w:sz w:val="17"/>
               </w:rPr>
-              <w:t>追踪与待同步</w:t>
+              <w:t>追踪与同步状态</w:t>
             </w:r>
           </w:p>
         </w:tc>
@@ -11369,7 +11369,7 @@
         <w:jc w:val="right"/>
       </w:pPr>
       <w:r>
-        <w:t>G2-R05应在spec.md中使用本文件相同的G2-FR和AC编号，并将本轮标记为“spec/RTM已同步”的可观察规则补入双镜像。RTM至少追踪原始FR、G2-FR、用户故事、AC、G2-RCLR、设计、实现、测试和结果；任何编号、范围或验收语义差异均阻断M2返工准出。</w:t>
+        <w:t>G2-R05已在spec.md中使用本文件相同的G2-FR和AC编号，并将相关可观察规则补入双镜像；G2-RCLR-001—010已在spec、RTM和正式镜像完成10/10同步。RTM至少追踪原始FR、G2-FR、用户故事、AC、G2-RCLR、设计、实现、测试和结果；任何编号、范围或验收语义差异均阻断M2返工准出。</w:t>
       </w:r>
     </w:p>
     <w:p>

</xml_diff>